<commit_message>
Who the hell is Turps and how did we find out about Brand?
</commit_message>
<xml_diff>
--- a/Chapter 13 - Pasties.docx
+++ b/Chapter 13 - Pasties.docx
@@ -116,164 +116,179 @@
         <w:t>”</w:t>
       </w:r>
       <w:r>
-        <w:t xml:space="preserve"> Because </w:t>
+        <w:t xml:space="preserve"> Because all his jobs were planned with military precision.</w:t>
+      </w:r>
+      <w:r>
+        <w:t xml:space="preserve"> Or at least that’s what they said. Remember, we’re dealing with villains. And the kind of villains who were doing jobs in 1994 – they weren’t like previous generations that had done national service.</w:t>
+      </w:r>
+      <w:r>
+        <w:t xml:space="preserve"> I think they might have been</w:t>
+      </w:r>
+      <w:r>
+        <w:t xml:space="preserve"> impressed with</w:t>
+      </w:r>
+      <w:r>
+        <w:t xml:space="preserve"> anybody who could get beyond planning what they had for breakfast.</w:t>
+      </w:r>
+      <w:r>
+        <w:t xml:space="preserve"> But it is true that Brand was a planner.</w:t>
+      </w:r>
+    </w:p>
+    <w:p>
+      <w:r>
+        <w:t xml:space="preserve">The first job that he’d been involved in was the </w:t>
+      </w:r>
+      <w:proofErr w:type="spellStart"/>
+      <w:r>
+        <w:t>C</w:t>
+      </w:r>
+      <w:r>
+        <w:t>adfield</w:t>
+      </w:r>
+      <w:proofErr w:type="spellEnd"/>
+      <w:r>
+        <w:t xml:space="preserve"> Farm heist. A</w:t>
+      </w:r>
+      <w:r>
+        <w:t>n unusual</w:t>
+      </w:r>
+      <w:r>
+        <w:t xml:space="preserve"> payroll that was </w:t>
+      </w:r>
+      <w:r>
+        <w:t xml:space="preserve">all </w:t>
+      </w:r>
+      <w:r>
+        <w:t>in cash</w:t>
+      </w:r>
+      <w:r>
+        <w:t xml:space="preserve">. Even though it was </w:t>
+      </w:r>
+      <w:r>
+        <w:t>in the early nineties.</w:t>
+      </w:r>
+      <w:r>
+        <w:t xml:space="preserve"> </w:t>
+      </w:r>
+      <w:r>
+        <w:t>They got away with all the money, b</w:t>
+      </w:r>
+      <w:r>
+        <w:t xml:space="preserve">ut there was a problem. </w:t>
+      </w:r>
+      <w:r>
+        <w:t xml:space="preserve">Brand </w:t>
+      </w:r>
+      <w:r>
+        <w:t>had put enormous amounts of effort into planning the robbery</w:t>
+      </w:r>
+      <w:r>
+        <w:t xml:space="preserve">. </w:t>
+      </w:r>
+      <w:r>
+        <w:t xml:space="preserve">And the gang </w:t>
+      </w:r>
+      <w:r>
+        <w:t xml:space="preserve">stopped the </w:t>
+      </w:r>
+      <w:r>
+        <w:t xml:space="preserve">transport that had all the money </w:t>
+      </w:r>
+      <w:r>
+        <w:t xml:space="preserve">in a culvert. They used some kind of jammers to stop the radio signals from the security vans. </w:t>
+      </w:r>
+      <w:r>
+        <w:t>And t</w:t>
+      </w:r>
+      <w:r>
+        <w:t>hey didn’t use violence.</w:t>
+      </w:r>
+      <w:r>
+        <w:t xml:space="preserve"> Well, nobody got hurt anyway.</w:t>
+      </w:r>
+      <w:r>
+        <w:t xml:space="preserve"> That was another Dobby signature. They used some kind of anaesthetic they’d nicked from </w:t>
+      </w:r>
+      <w:r>
+        <w:t>a</w:t>
+      </w:r>
+      <w:r>
+        <w:t xml:space="preserve"> hospital.</w:t>
+      </w:r>
+      <w:r>
+        <w:t xml:space="preserve"> And masks. </w:t>
+      </w:r>
+    </w:p>
+    <w:p>
+      <w:r>
+        <w:t>The anaesthetic had the added benefit of wiping the memories of the guards in the van – none of them could remember a thing.  Not even the one who later, it turned out had been an accomplice.</w:t>
+      </w:r>
+      <w:r>
+        <w:t xml:space="preserve"> Imagine his surprise!</w:t>
+      </w:r>
+      <w:r>
+        <w:br/>
+      </w:r>
+      <w:r>
+        <w:br/>
+        <w:t xml:space="preserve">This was Dobby’s first known real job. Before that, he literally had been nicking stuff off the back of lorries. </w:t>
+      </w:r>
+      <w:r>
+        <w:t>It was like he’d sprung as a criminal mastermind fully formed. Well almost. I</w:t>
+      </w:r>
+      <w:r>
+        <w:t xml:space="preserve">t had all kinds of inspired touches.  </w:t>
+      </w:r>
+    </w:p>
+    <w:p>
+      <w:r>
+        <w:t xml:space="preserve">There was just one problem. </w:t>
       </w:r>
       <w:proofErr w:type="gramStart"/>
       <w:r>
-        <w:t>all of</w:t>
+        <w:t>Actually</w:t>
+      </w:r>
+      <w:r>
+        <w:t>,</w:t>
+      </w:r>
+      <w:r>
+        <w:t xml:space="preserve"> </w:t>
+      </w:r>
+      <w:r>
+        <w:t>there</w:t>
       </w:r>
       <w:proofErr w:type="gramEnd"/>
       <w:r>
-        <w:t xml:space="preserve"> his jobs were planned with military precision.</w:t>
-      </w:r>
-      <w:r>
-        <w:t xml:space="preserve"> Or at least that’s what they said. Remember, we’re dealing with villains. And the kind of villains who were doing jobs in 1994 – they weren’t like previous generations that had done national service.</w:t>
-      </w:r>
-      <w:r>
-        <w:t xml:space="preserve"> I think they might have been anybody who could get beyond planning what they had for breakfast.</w:t>
-      </w:r>
-      <w:r>
-        <w:t xml:space="preserve"> But it is true that Brand was a planner.</w:t>
-      </w:r>
-    </w:p>
-    <w:p>
-      <w:r>
-        <w:t xml:space="preserve">The first job that he’d been involved in was the </w:t>
-      </w:r>
-      <w:proofErr w:type="spellStart"/>
-      <w:r>
-        <w:t>C</w:t>
-      </w:r>
-      <w:r>
-        <w:t>adfield</w:t>
-      </w:r>
-      <w:proofErr w:type="spellEnd"/>
-      <w:r>
-        <w:t xml:space="preserve"> Farm heist. A</w:t>
-      </w:r>
-      <w:r>
-        <w:t>n unusual</w:t>
-      </w:r>
-      <w:r>
-        <w:t xml:space="preserve"> payroll that was </w:t>
-      </w:r>
-      <w:r>
-        <w:t xml:space="preserve">all </w:t>
-      </w:r>
-      <w:r>
-        <w:t>in cash</w:t>
-      </w:r>
-      <w:r>
-        <w:t>, in the early nineties.</w:t>
-      </w:r>
-      <w:r>
         <w:t xml:space="preserve"> </w:t>
       </w:r>
       <w:r>
-        <w:t>They got away with all the money, b</w:t>
-      </w:r>
-      <w:r>
-        <w:t xml:space="preserve">ut there was a problem. </w:t>
-      </w:r>
-      <w:r>
-        <w:t xml:space="preserve">Brand </w:t>
-      </w:r>
-      <w:r>
-        <w:t>had put enormous amounts of effort into planning the robbery</w:t>
-      </w:r>
-      <w:r>
-        <w:t xml:space="preserve">. </w:t>
-      </w:r>
-      <w:r>
-        <w:t xml:space="preserve">And the gang </w:t>
-      </w:r>
-      <w:r>
-        <w:t xml:space="preserve">stopped the </w:t>
-      </w:r>
-      <w:r>
-        <w:t xml:space="preserve">transport that had all the money </w:t>
-      </w:r>
-      <w:r>
-        <w:t xml:space="preserve">in a culvert. They used some kind of jammers to stop the radio signals from the security vans. </w:t>
-      </w:r>
-      <w:r>
-        <w:t>And t</w:t>
-      </w:r>
-      <w:r>
-        <w:t>hey didn’t use violence.</w:t>
-      </w:r>
-      <w:r>
-        <w:t xml:space="preserve"> Well, nobody got hurt anyway.</w:t>
-      </w:r>
-      <w:r>
-        <w:t xml:space="preserve"> That was another Dobby signature. They used some kind of anaesthetic they’d nicked from the hospital.</w:t>
-      </w:r>
-      <w:r>
-        <w:t xml:space="preserve"> And masks. </w:t>
-      </w:r>
-    </w:p>
-    <w:p>
-      <w:r>
-        <w:t>The anaesthetic had the added benefit of wiping the memories of the guards in the van – none of them could remember a thing.  Not even the one who later, it turned out had been an accomplice.</w:t>
-        <w:br/>
-        <w:br/>
-        <w:t xml:space="preserve">This was Dobby’s first known real job. Before that, he literally had been nicking stuff off the back of lorries. And it had all kinds of inspired touches.  </w:t>
-      </w:r>
-      <w:r/>
-      <w:r/>
-      <w:r/>
-      <w:r/>
-      <w:r/>
-      <w:r/>
-      <w:proofErr w:type="spellStart"/>
-      <w:r/>
-      <w:proofErr w:type="spellEnd"/>
-      <w:r/>
-      <w:r/>
-      <w:r/>
-      <w:r/>
-    </w:p>
-    <w:p>
-      <w:r>
-        <w:t xml:space="preserve">There was just one problem. </w:t>
+        <w:t>were</w:t>
+      </w:r>
+      <w:r>
+        <w:t xml:space="preserve"> two problems. </w:t>
+      </w:r>
+      <w:r>
+        <w:t xml:space="preserve">The first problem </w:t>
+      </w:r>
+      <w:r>
+        <w:t xml:space="preserve">– and this might not sound like one - </w:t>
+      </w:r>
+      <w:r>
+        <w:t>was that t</w:t>
+      </w:r>
+      <w:r>
+        <w:t>hey got away with a lot of money</w:t>
+      </w:r>
+      <w:r>
+        <w:t xml:space="preserve">. It was more than in a normal week because they were going to lay off about half of the workers. The project was winding down, so there </w:t>
       </w:r>
       <w:proofErr w:type="gramStart"/>
       <w:r>
-        <w:t>Actually</w:t>
-      </w:r>
-      <w:r>
-        <w:t>,</w:t>
-      </w:r>
-      <w:r>
-        <w:t xml:space="preserve"> </w:t>
-      </w:r>
-      <w:r>
-        <w:t>there</w:t>
+        <w:t>were</w:t>
       </w:r>
       <w:proofErr w:type="gramEnd"/>
       <w:r>
-        <w:t xml:space="preserve"> </w:t>
-      </w:r>
-      <w:r>
-        <w:t>were</w:t>
-      </w:r>
-      <w:r>
-        <w:t xml:space="preserve"> two problems. </w:t>
-      </w:r>
-      <w:r>
-        <w:t xml:space="preserve">The first problem </w:t>
-      </w:r>
-      <w:r>
-        <w:t xml:space="preserve">– and this might not sound like one - </w:t>
-      </w:r>
-      <w:r>
-        <w:t>was that t</w:t>
-      </w:r>
-      <w:r>
-        <w:t>hey got away with a lot of money</w:t>
-      </w:r>
-      <w:r>
-        <w:t>. It was more than in a normal week because they were going to lay off about half of the workers. The project was winding down, so there was holiday, bonuses</w:t>
+        <w:t xml:space="preserve"> holiday, bonuses</w:t>
       </w:r>
       <w:r>
         <w:t xml:space="preserve">. </w:t>
@@ -419,13 +434,8 @@
         <w:t xml:space="preserve"> he wrote a book</w:t>
       </w:r>
       <w:r>
-        <w:t xml:space="preserve"> letting on how he did it – or letting on some of it </w:t>
-      </w:r>
-      <w:proofErr w:type="gramStart"/>
-      <w:r>
-        <w:t>anyway  -</w:t>
-      </w:r>
-      <w:proofErr w:type="gramEnd"/>
+        <w:t xml:space="preserve"> letting on how he did it – or letting on some of it anyway -</w:t>
+      </w:r>
       <w:r>
         <w:t xml:space="preserve"> </w:t>
       </w:r>
@@ -444,7 +454,7 @@
     </w:p>
     <w:p>
       <w:r>
-        <w:t xml:space="preserve">Basically, as a young, horny, nerdy man, he’d spend a lot of time in strip clubs. And because he was essentially harmless, he’d ended up talking to a lot of the strippers. </w:t>
+        <w:t xml:space="preserve">Basically, as a young, horny, nerdy man, he’d spend a lot of time in strip clubs. And because he was harmless, he’d ended up talking to a lot of the strippers. </w:t>
       </w:r>
     </w:p>
     <w:p>
@@ -498,6 +508,9 @@
     </w:p>
     <w:p>
       <w:r>
+        <w:t xml:space="preserve">I think we might be digressing ever so slightly. Anyway. </w:t>
+      </w:r>
+      <w:r>
         <w:t>There were two reasons Vanessa was giving up. Firstly, gravity was making the job of getting the tassels to rotate, just a little bit trickier every day. Secondly, a recession, maybe even a depression was coming.</w:t>
       </w:r>
     </w:p>
@@ -520,10 +533,19 @@
     <w:p>
       <w:r>
         <w:lastRenderedPageBreak/>
+        <w:t>“</w:t>
+      </w:r>
+      <w:r>
         <w:t>Not enough glue on the pasties.</w:t>
       </w:r>
-    </w:p>
-    <w:p>
+      <w:r>
+        <w:t>”</w:t>
+      </w:r>
+    </w:p>
+    <w:p>
+      <w:r>
+        <w:t>“</w:t>
+      </w:r>
       <w:r>
         <w:t xml:space="preserve">Bernard didn’t want to suggest that maybe it was that Vanessa’s charms were, perhaps fading. But Vanessa made her money and had managed to keep herself safe (mostly) by knowing what men were thinking. </w:t>
       </w:r>
@@ -544,26 +566,56 @@
       <w:r>
         <w:t>.</w:t>
       </w:r>
-    </w:p>
-    <w:p>
-      <w:r>
-        <w:t xml:space="preserve">Last time? </w:t>
-      </w:r>
-    </w:p>
-    <w:p>
+      <w:r>
+        <w:t>”</w:t>
+      </w:r>
+    </w:p>
+    <w:p>
+      <w:r>
+        <w:t>“</w:t>
+      </w:r>
+      <w:r>
+        <w:t>Last time?</w:t>
+      </w:r>
+      <w:r>
+        <w:t>”</w:t>
+      </w:r>
+      <w:r>
+        <w:t xml:space="preserve"> </w:t>
+      </w:r>
+    </w:p>
+    <w:p>
+      <w:r>
+        <w:t>“</w:t>
+      </w:r>
       <w:r>
         <w:t>Last time there was a recession.</w:t>
       </w:r>
-    </w:p>
-    <w:p>
+      <w:r>
+        <w:t>”</w:t>
+      </w:r>
+    </w:p>
+    <w:p>
+      <w:r>
+        <w:t>“</w:t>
+      </w:r>
       <w:r>
         <w:t>This is all very educational, but why are you telling me this Dr?</w:t>
       </w:r>
-    </w:p>
-    <w:p>
+      <w:r>
+        <w:t>”</w:t>
+      </w:r>
+    </w:p>
+    <w:p>
+      <w:r>
+        <w:t>“</w:t>
+      </w:r>
       <w:r>
         <w:t>What did young men who’d never had money before and suddenly had suitcases full of cash spend their money on?</w:t>
       </w:r>
+      <w:r>
+        <w:t>”</w:t>
+      </w:r>
     </w:p>
     <w:p>
       <w:r>
@@ -590,22 +642,14 @@
         <w:t>That’s how they found most of the gang.</w:t>
       </w:r>
       <w:r>
-        <w:t>”</w:t>
+        <w:t xml:space="preserve"> And h</w:t>
+      </w:r>
+      <w:r>
+        <w:t>onour among thieves? Bollocks. They</w:t>
       </w:r>
       <w:r>
         <w:t xml:space="preserve"> </w:t>
       </w:r>
-    </w:p>
-    <w:p>
-      <w:r>
-        <w:t>“</w:t>
-      </w:r>
-      <w:r>
-        <w:t>Honour among thieves? Bollocks. They</w:t>
-      </w:r>
-      <w:r>
-        <w:t xml:space="preserve"> </w:t>
-      </w:r>
       <w:r>
         <w:t>all g</w:t>
       </w:r>
@@ -619,7 +663,20 @@
         <w:t xml:space="preserve"> Also, the coppers picked up the idea that the other members of the gang didn’t like him that much. He was the one who’d insisted on wearing gloves all the time. He was the one who’d been lecturing them about not spending their money all at once. He was the one who’d been right.</w:t>
       </w:r>
       <w:r>
-        <w:t xml:space="preserve"> And we all know.” Pausing looked at Klee, very pointedly, we all know how annoying that can be. </w:t>
+        <w:t xml:space="preserve"> And we all know.”</w:t>
+      </w:r>
+    </w:p>
+    <w:p>
+      <w:r>
+        <w:t>Pausing looked at Klee, very pointedly,</w:t>
+      </w:r>
+    </w:p>
+    <w:p>
+      <w:r>
+        <w:t>“W</w:t>
+      </w:r>
+      <w:r>
+        <w:t xml:space="preserve">e all know how annoying that can be. </w:t>
       </w:r>
       <w:r>
         <w:t xml:space="preserve"> They told themselves that somehow it was his fault that they’d got caught. They were more than keen to grass him up.</w:t>
@@ -637,7 +694,6 @@
       <w:r>
         <w:t xml:space="preserve">Dobby Brand learned a lot from that job. Firstly, you needed to do as much planning about what to do with the money as you do about how to take it. </w:t>
       </w:r>
-      <w:r/>
     </w:p>
     <w:p>
       <w:r>
@@ -671,10 +727,27 @@
         <w:t>gang</w:t>
       </w:r>
       <w:r>
-        <w:t xml:space="preserve"> had records. Well, they had military records.</w:t>
-      </w:r>
-      <w:r>
-        <w:t xml:space="preserve"> Again. No actual violence</w:t>
+        <w:t xml:space="preserve"> had records. </w:t>
+      </w:r>
+      <w:r>
+        <w:t xml:space="preserve">Stay away from villains? See? </w:t>
+      </w:r>
+      <w:proofErr w:type="gramStart"/>
+      <w:r>
+        <w:t>Well</w:t>
+      </w:r>
+      <w:proofErr w:type="gramEnd"/>
+      <w:r>
+        <w:t>, they had military records.</w:t>
+      </w:r>
+      <w:r>
+        <w:t xml:space="preserve"> Again. </w:t>
+      </w:r>
+      <w:r>
+        <w:t>There was no</w:t>
+      </w:r>
+      <w:r>
+        <w:t xml:space="preserve"> actual violence</w:t>
       </w:r>
       <w:r>
         <w:t xml:space="preserve"> on the job</w:t>
@@ -688,12 +761,15 @@
         <w:t>And as much attention was paid to getting rid of the gold and turning it into money as was paid in the planning of the job.</w:t>
       </w:r>
       <w:r>
-        <w:t xml:space="preserve"> They had a smelter. They had a moody gold dealer. They had someone to launder the money into houses and businesses. Well, that’s what they had in the side that got caught. Because Dobby Brand, after a brief discussion in a Nissen hut in Essex with the other members of the gang – was never seen again.</w:t>
-      </w:r>
-    </w:p>
-    <w:p>
+        <w:t xml:space="preserve"> They had a smelter. They had a moody gold dealer. They had someone to launder the money into houses and businesses. Well, that’s what </w:t>
+      </w:r>
       <w:r>
         <w:lastRenderedPageBreak/>
+        <w:t>they had in the side that got caught. Because Dobby Brand, after a brief discussion in a Nissen hut in Essex with the other members of the gang – was never seen again.</w:t>
+      </w:r>
+    </w:p>
+    <w:p>
+      <w:r>
         <w:t xml:space="preserve">The job relied on the fact that Stansted Airport has a huge runway. The main security strategy for this gold, was to load it onto the plane in a far corner, </w:t>
       </w:r>
       <w:proofErr w:type="gramStart"/>
@@ -750,70 +826,83 @@
       <w:r>
         <w:t>Masks on. Filled the van with sleepy, sleepy, goodnight fumes. Charges on the doors, They knew exactly where to blow the doors to get the hinges and 5, 4, 3, 2, 1 and boom! “Robert est son oncle.”</w:t>
       </w:r>
-      <w:r/>
-      <w:r/>
-      <w:r/>
-      <w:r/>
-      <w:r/>
-      <w:r/>
-      <w:r/>
-      <w:r/>
-      <w:r/>
-      <w:r/>
-      <w:r/>
+    </w:p>
+    <w:p>
+      <w:r>
+        <w:t>“What?”</w:t>
+      </w:r>
+    </w:p>
+    <w:p>
+      <w:r>
+        <w:t>“Bob’s your mother’s weird older brother who passes out at Christmas</w:t>
+      </w:r>
+      <w:r>
+        <w:t xml:space="preserve"> while the kids are opening their presents and the cartoons are still on. He doesn’t</w:t>
+      </w:r>
+      <w:r>
+        <w:t xml:space="preserve"> even make it to lunch.”</w:t>
+      </w:r>
+    </w:p>
+    <w:p>
+      <w:r>
+        <w:t>“Actually, he was called Eric.”</w:t>
+      </w:r>
+    </w:p>
+    <w:p>
+      <w:r>
+        <w:t>“This is a brilliant theory. There’s just one problem with it.”</w:t>
+      </w:r>
+    </w:p>
+    <w:p>
+      <w:r>
+        <w:t>“</w:t>
+      </w:r>
       <w:proofErr w:type="gramStart"/>
-      <w:r/>
+      <w:r>
+        <w:t>Oh</w:t>
+      </w:r>
       <w:proofErr w:type="gramEnd"/>
-      <w:r/>
-      <w:r/>
-      <w:r/>
-      <w:r/>
-      <w:r/>
-      <w:r/>
-      <w:r/>
+      <w:r>
+        <w:t xml:space="preserve"> you’re </w:t>
+      </w:r>
       <w:proofErr w:type="spellStart"/>
-      <w:r/>
-      <w:r/>
+      <w:r>
+        <w:t>gonna</w:t>
+      </w:r>
       <w:proofErr w:type="spellEnd"/>
-      <w:r/>
-    </w:p>
-    <w:p>
-      <w:r>
-        <w:t>“What?”</w:t>
-      </w:r>
-    </w:p>
-    <w:p>
-      <w:r>
-        <w:t>“Bob’s your mother’s weird older brother who passes out at Christmas</w:t>
-      </w:r>
-      <w:r>
-        <w:t xml:space="preserve"> while the kids are opening their presents and the cartoons are still on. He doesn’t</w:t>
-      </w:r>
-      <w:r>
-        <w:t xml:space="preserve"> even make it to lunch.”</w:t>
-      </w:r>
-    </w:p>
-    <w:p>
-      <w:r>
-        <w:t>“Actually, he was called Eric.”</w:t>
-      </w:r>
-    </w:p>
-    <w:p>
-      <w:r>
-        <w:t>“This is a brilliant theory. There’s just one problem with it.”</w:t>
-      </w:r>
-    </w:p>
-    <w:p>
-      <w:r>
-        <w:t>“</w:t>
+      <w:r>
+        <w:t xml:space="preserve"> </w:t>
+      </w:r>
+      <w:proofErr w:type="spellStart"/>
+      <w:r>
+        <w:t>nit pick</w:t>
+      </w:r>
+      <w:proofErr w:type="spellEnd"/>
+      <w:r>
+        <w:t xml:space="preserve"> </w:t>
       </w:r>
       <w:proofErr w:type="gramStart"/>
       <w:r>
-        <w:t>Oh</w:t>
+        <w:t>now</w:t>
       </w:r>
       <w:proofErr w:type="gramEnd"/>
       <w:r>
-        <w:t xml:space="preserve"> you’re </w:t>
+        <w:t xml:space="preserve"> are you? Pick holes in it?”</w:t>
+      </w:r>
+    </w:p>
+    <w:p>
+      <w:r>
+        <w:t>“No.”</w:t>
+      </w:r>
+    </w:p>
+    <w:p>
+      <w:r>
+        <w:t>“No?”</w:t>
+      </w:r>
+    </w:p>
+    <w:p>
+      <w:r>
+        <w:t xml:space="preserve">“I’m not </w:t>
       </w:r>
       <w:proofErr w:type="spellStart"/>
       <w:r>
@@ -821,81 +910,42 @@
       </w:r>
       <w:proofErr w:type="spellEnd"/>
       <w:r>
+        <w:t xml:space="preserve"> pick holes. I’m just going to blow one giant hole.</w:t>
+      </w:r>
+      <w:r>
+        <w:t xml:space="preserve"> Michael Caine blowing the doors off hole. </w:t>
+      </w:r>
+      <w:proofErr w:type="spellStart"/>
+      <w:r>
+        <w:t>Boht</w:t>
+      </w:r>
+      <w:proofErr w:type="spellEnd"/>
+      <w:r>
+        <w:t xml:space="preserve"> can’t be Brand.”</w:t>
+      </w:r>
+    </w:p>
+    <w:p>
+      <w:r>
+        <w:t>“Why not?”</w:t>
+      </w:r>
+    </w:p>
+    <w:p>
+      <w:r>
+        <w:t>“Because Brand has been in the freezer in the crypt. For the last thirty years.”</w:t>
+      </w:r>
+    </w:p>
+    <w:p>
+      <w:r>
+        <w:t>“It’s not a crypt. Unitarian chapels didn’t have…”</w:t>
+      </w:r>
+    </w:p>
+    <w:p>
+      <w:r>
+        <w:t>“The cellar.</w:t>
+      </w:r>
+      <w:r>
         <w:t xml:space="preserve"> </w:t>
       </w:r>
-      <w:proofErr w:type="spellStart"/>
-      <w:r>
-        <w:t>nit pick</w:t>
-      </w:r>
-      <w:proofErr w:type="spellEnd"/>
-      <w:r>
-        <w:t xml:space="preserve"> </w:t>
-      </w:r>
-      <w:proofErr w:type="gramStart"/>
-      <w:r>
-        <w:t>now</w:t>
-      </w:r>
-      <w:proofErr w:type="gramEnd"/>
-      <w:r>
-        <w:t xml:space="preserve"> are you? Pick holes in it?”</w:t>
-      </w:r>
-    </w:p>
-    <w:p>
-      <w:r>
-        <w:t>“No.”</w:t>
-      </w:r>
-    </w:p>
-    <w:p>
-      <w:r>
-        <w:t>“No?”</w:t>
-      </w:r>
-    </w:p>
-    <w:p>
-      <w:r>
-        <w:t xml:space="preserve">“I’m not </w:t>
-      </w:r>
-      <w:proofErr w:type="spellStart"/>
-      <w:r>
-        <w:t>gonna</w:t>
-      </w:r>
-      <w:proofErr w:type="spellEnd"/>
-      <w:r>
-        <w:t xml:space="preserve"> pick holes. I’m just going to blow one giant hole.</w:t>
-      </w:r>
-      <w:r>
-        <w:t xml:space="preserve"> Michael Caine blowing the doors off hole. </w:t>
-      </w:r>
-      <w:proofErr w:type="spellStart"/>
-      <w:r>
-        <w:t>Boht</w:t>
-      </w:r>
-      <w:proofErr w:type="spellEnd"/>
-      <w:r>
-        <w:t xml:space="preserve"> can’t be Brand.”</w:t>
-      </w:r>
-    </w:p>
-    <w:p>
-      <w:r>
-        <w:t>“Why not?”</w:t>
-      </w:r>
-    </w:p>
-    <w:p>
-      <w:r>
-        <w:t>“Because Brand has been in the freezer in the crypt. For the last thirty years.”</w:t>
-      </w:r>
-    </w:p>
-    <w:p>
-      <w:r>
-        <w:t>“It’s not a crypt. Unitarian chapels didn’t have…”</w:t>
-      </w:r>
-    </w:p>
-    <w:p>
-      <w:r>
-        <w:t>“The cellar.</w:t>
-      </w:r>
-      <w:r>
-        <w:t xml:space="preserve"> </w:t>
-      </w:r>
       <w:r>
         <w:t xml:space="preserve">It’s downstairs. It’s dark. It’s a bit damp. </w:t>
       </w:r>
@@ -906,12 +956,15 @@
         <w:t xml:space="preserve"> The freezer in the cellar</w:t>
       </w:r>
       <w:r>
-        <w:t>. The body in the freezer in the cellar? It’s Brand. From the sell-by dates on the peas – it’s tricky of course, because it’s frozen food. I don’t think he made it to that Christmas 1994.”</w:t>
-      </w:r>
-    </w:p>
-    <w:p>
+        <w:t xml:space="preserve">. The body in the freezer in the cellar? It’s Brand. From the sell-by dates on the </w:t>
+      </w:r>
       <w:r>
         <w:lastRenderedPageBreak/>
+        <w:t>peas – it’s tricky of course, because it’s frozen food. I don’t think he made it to that Christmas 1994.”</w:t>
+      </w:r>
+    </w:p>
+    <w:p>
+      <w:r>
         <w:t xml:space="preserve">Klee held up a printout of a black and white photograph of Brand. </w:t>
       </w:r>
     </w:p>

</xml_diff>